<commit_message>
ajuste de plantilla de observador
</commit_message>
<xml_diff>
--- a/public/plantillas/plantilla_observador.docx
+++ b/public/plantillas/plantilla_observador.docx
@@ -28,6 +28,38 @@
       <w:pPr>
         <w:jc w:val="center"/>
         <w:rPr>
+          <w:rFonts w:ascii="Arial" w:hAnsi="Arial" w:cs="Arial"/>
+          <w:b/>
+          <w:bCs/>
+          <w:sz w:val="20"/>
+          <w:szCs w:val="20"/>
+        </w:rPr>
+      </w:pPr>
+      <w:r>
+        <w:rPr>
+          <w:rFonts w:ascii="Arial" w:hAnsi="Arial" w:cs="Arial"/>
+          <w:b/>
+          <w:bCs/>
+          <w:sz w:val="20"/>
+          <w:szCs w:val="20"/>
+        </w:rPr>
+        <w:t>AÑO LECTIVO 202</w:t>
+      </w:r>
+      <w:r>
+        <w:rPr>
+          <w:rFonts w:ascii="Arial" w:hAnsi="Arial" w:cs="Arial"/>
+          <w:b/>
+          <w:bCs/>
+          <w:sz w:val="20"/>
+          <w:szCs w:val="20"/>
+        </w:rPr>
+        <w:t>6</w:t>
+      </w:r>
+    </w:p>
+    <w:p>
+      <w:pPr>
+        <w:jc w:val="center"/>
+        <w:rPr>
           <w:b/>
           <w:bCs/>
           <w:sz w:val="18"/>
@@ -36,23 +68,32 @@
       </w:pPr>
       <w:r>
         <w:rPr>
-          <w:rFonts w:ascii="Arial" w:hAnsi="Arial" w:cs="Arial"/>
           <w:b/>
           <w:bCs/>
-          <w:sz w:val="20"/>
-          <w:szCs w:val="20"/>
-        </w:rPr>
-        <w:t>AÑO LECTIVO 202</w:t>
+          <w:sz w:val="18"/>
+          <w:szCs w:val="18"/>
+        </w:rPr>
+        <w:t>%#</w:t>
       </w:r>
+      <w:proofErr w:type="spellStart"/>
       <w:r>
         <w:rPr>
-          <w:rFonts w:ascii="Arial" w:hAnsi="Arial" w:cs="Arial"/>
           <w:b/>
           <w:bCs/>
-          <w:sz w:val="20"/>
-          <w:szCs w:val="20"/>
-        </w:rPr>
-        <w:t>5</w:t>
+          <w:sz w:val="18"/>
+          <w:szCs w:val="18"/>
+        </w:rPr>
+        <w:t>estudiantes_lista</w:t>
+      </w:r>
+      <w:proofErr w:type="spellEnd"/>
+      <w:r>
+        <w:rPr>
+          <w:b/>
+          <w:bCs/>
+          <w:sz w:val="18"/>
+          <w:szCs w:val="18"/>
+        </w:rPr>
+        <w:t>%</w:t>
       </w:r>
     </w:p>
     <w:p>
@@ -1843,18 +1884,465 @@
         <w:spacing w:after="0" w:line="240" w:lineRule="auto"/>
         <w:jc w:val="center"/>
         <w:rPr>
+          <w:sz w:val="20"/>
+          <w:szCs w:val="20"/>
+        </w:rPr>
+      </w:pPr>
+      <w:r>
+        <w:rPr>
+          <w:sz w:val="20"/>
+          <w:szCs w:val="20"/>
+        </w:rPr>
+        <w:t>Firma del Docente</w:t>
+      </w:r>
+    </w:p>
+    <w:p>
+      <w:pPr>
+        <w:tabs>
+          <w:tab w:val="left" w:pos="1500"/>
+        </w:tabs>
+        <w:spacing w:after="0" w:line="240" w:lineRule="auto"/>
+        <w:jc w:val="center"/>
+        <w:rPr>
+          <w:sz w:val="20"/>
+          <w:szCs w:val="20"/>
+        </w:rPr>
+      </w:pPr>
+    </w:p>
+    <w:p>
+      <w:pPr>
+        <w:tabs>
+          <w:tab w:val="left" w:pos="1500"/>
+        </w:tabs>
+        <w:spacing w:after="0" w:line="240" w:lineRule="auto"/>
+        <w:jc w:val="center"/>
+        <w:rPr>
+          <w:sz w:val="20"/>
+          <w:szCs w:val="20"/>
+        </w:rPr>
+      </w:pPr>
+    </w:p>
+    <w:p>
+      <w:pPr>
+        <w:tabs>
+          <w:tab w:val="left" w:pos="1500"/>
+        </w:tabs>
+        <w:spacing w:after="0" w:line="240" w:lineRule="auto"/>
+        <w:jc w:val="center"/>
+        <w:rPr>
+          <w:sz w:val="20"/>
+          <w:szCs w:val="20"/>
+        </w:rPr>
+      </w:pPr>
+    </w:p>
+    <w:p>
+      <w:pPr>
+        <w:tabs>
+          <w:tab w:val="left" w:pos="1500"/>
+        </w:tabs>
+        <w:spacing w:after="0" w:line="240" w:lineRule="auto"/>
+        <w:jc w:val="center"/>
+        <w:rPr>
+          <w:sz w:val="20"/>
+          <w:szCs w:val="20"/>
+        </w:rPr>
+      </w:pPr>
+    </w:p>
+    <w:p>
+      <w:pPr>
+        <w:tabs>
+          <w:tab w:val="left" w:pos="1500"/>
+        </w:tabs>
+        <w:spacing w:after="0" w:line="240" w:lineRule="auto"/>
+        <w:jc w:val="center"/>
+        <w:rPr>
+          <w:sz w:val="20"/>
+          <w:szCs w:val="20"/>
+        </w:rPr>
+      </w:pPr>
+    </w:p>
+    <w:p>
+      <w:pPr>
+        <w:tabs>
+          <w:tab w:val="left" w:pos="1500"/>
+        </w:tabs>
+        <w:spacing w:after="0" w:line="240" w:lineRule="auto"/>
+        <w:jc w:val="center"/>
+        <w:rPr>
+          <w:sz w:val="20"/>
+          <w:szCs w:val="20"/>
+        </w:rPr>
+      </w:pPr>
+    </w:p>
+    <w:p>
+      <w:pPr>
+        <w:tabs>
+          <w:tab w:val="left" w:pos="1500"/>
+        </w:tabs>
+        <w:spacing w:after="0" w:line="240" w:lineRule="auto"/>
+        <w:jc w:val="center"/>
+        <w:rPr>
+          <w:sz w:val="20"/>
+          <w:szCs w:val="20"/>
+        </w:rPr>
+      </w:pPr>
+    </w:p>
+    <w:p>
+      <w:pPr>
+        <w:tabs>
+          <w:tab w:val="left" w:pos="1500"/>
+        </w:tabs>
+        <w:spacing w:after="0" w:line="240" w:lineRule="auto"/>
+        <w:jc w:val="center"/>
+        <w:rPr>
+          <w:sz w:val="20"/>
+          <w:szCs w:val="20"/>
+        </w:rPr>
+      </w:pPr>
+    </w:p>
+    <w:p>
+      <w:pPr>
+        <w:tabs>
+          <w:tab w:val="left" w:pos="1500"/>
+        </w:tabs>
+        <w:spacing w:after="0" w:line="240" w:lineRule="auto"/>
+        <w:jc w:val="center"/>
+        <w:rPr>
+          <w:sz w:val="20"/>
+          <w:szCs w:val="20"/>
+        </w:rPr>
+      </w:pPr>
+    </w:p>
+    <w:p>
+      <w:pPr>
+        <w:tabs>
+          <w:tab w:val="left" w:pos="1500"/>
+        </w:tabs>
+        <w:spacing w:after="0" w:line="240" w:lineRule="auto"/>
+        <w:jc w:val="center"/>
+        <w:rPr>
+          <w:sz w:val="20"/>
+          <w:szCs w:val="20"/>
+        </w:rPr>
+      </w:pPr>
+    </w:p>
+    <w:p>
+      <w:pPr>
+        <w:tabs>
+          <w:tab w:val="left" w:pos="1500"/>
+        </w:tabs>
+        <w:spacing w:after="0" w:line="240" w:lineRule="auto"/>
+        <w:jc w:val="center"/>
+        <w:rPr>
+          <w:sz w:val="20"/>
+          <w:szCs w:val="20"/>
+        </w:rPr>
+      </w:pPr>
+    </w:p>
+    <w:p>
+      <w:pPr>
+        <w:tabs>
+          <w:tab w:val="left" w:pos="1500"/>
+        </w:tabs>
+        <w:spacing w:after="0" w:line="240" w:lineRule="auto"/>
+        <w:jc w:val="center"/>
+        <w:rPr>
+          <w:sz w:val="20"/>
+          <w:szCs w:val="20"/>
+        </w:rPr>
+      </w:pPr>
+    </w:p>
+    <w:p>
+      <w:pPr>
+        <w:tabs>
+          <w:tab w:val="left" w:pos="1500"/>
+        </w:tabs>
+        <w:spacing w:after="0" w:line="240" w:lineRule="auto"/>
+        <w:jc w:val="center"/>
+        <w:rPr>
+          <w:sz w:val="20"/>
+          <w:szCs w:val="20"/>
+        </w:rPr>
+      </w:pPr>
+    </w:p>
+    <w:p>
+      <w:pPr>
+        <w:tabs>
+          <w:tab w:val="left" w:pos="1500"/>
+        </w:tabs>
+        <w:spacing w:after="0" w:line="240" w:lineRule="auto"/>
+        <w:jc w:val="center"/>
+        <w:rPr>
+          <w:sz w:val="20"/>
+          <w:szCs w:val="20"/>
+        </w:rPr>
+      </w:pPr>
+    </w:p>
+    <w:p>
+      <w:pPr>
+        <w:tabs>
+          <w:tab w:val="left" w:pos="1500"/>
+        </w:tabs>
+        <w:spacing w:after="0" w:line="240" w:lineRule="auto"/>
+        <w:jc w:val="center"/>
+        <w:rPr>
+          <w:sz w:val="20"/>
+          <w:szCs w:val="20"/>
+        </w:rPr>
+      </w:pPr>
+    </w:p>
+    <w:p>
+      <w:pPr>
+        <w:tabs>
+          <w:tab w:val="left" w:pos="1500"/>
+        </w:tabs>
+        <w:spacing w:after="0" w:line="240" w:lineRule="auto"/>
+        <w:jc w:val="center"/>
+        <w:rPr>
+          <w:sz w:val="20"/>
+          <w:szCs w:val="20"/>
+        </w:rPr>
+      </w:pPr>
+    </w:p>
+    <w:p>
+      <w:pPr>
+        <w:tabs>
+          <w:tab w:val="left" w:pos="1500"/>
+        </w:tabs>
+        <w:spacing w:after="0" w:line="240" w:lineRule="auto"/>
+        <w:jc w:val="center"/>
+        <w:rPr>
+          <w:sz w:val="20"/>
+          <w:szCs w:val="20"/>
+        </w:rPr>
+      </w:pPr>
+    </w:p>
+    <w:p>
+      <w:pPr>
+        <w:tabs>
+          <w:tab w:val="left" w:pos="1500"/>
+        </w:tabs>
+        <w:spacing w:after="0" w:line="240" w:lineRule="auto"/>
+        <w:jc w:val="center"/>
+        <w:rPr>
+          <w:sz w:val="20"/>
+          <w:szCs w:val="20"/>
+        </w:rPr>
+      </w:pPr>
+    </w:p>
+    <w:p>
+      <w:pPr>
+        <w:tabs>
+          <w:tab w:val="left" w:pos="1500"/>
+        </w:tabs>
+        <w:spacing w:after="0" w:line="240" w:lineRule="auto"/>
+        <w:jc w:val="center"/>
+        <w:rPr>
+          <w:sz w:val="20"/>
+          <w:szCs w:val="20"/>
+        </w:rPr>
+      </w:pPr>
+    </w:p>
+    <w:p>
+      <w:pPr>
+        <w:tabs>
+          <w:tab w:val="left" w:pos="1500"/>
+        </w:tabs>
+        <w:spacing w:after="0" w:line="240" w:lineRule="auto"/>
+        <w:jc w:val="center"/>
+        <w:rPr>
+          <w:sz w:val="20"/>
+          <w:szCs w:val="20"/>
+        </w:rPr>
+      </w:pPr>
+    </w:p>
+    <w:p>
+      <w:pPr>
+        <w:tabs>
+          <w:tab w:val="left" w:pos="1500"/>
+        </w:tabs>
+        <w:spacing w:after="0" w:line="240" w:lineRule="auto"/>
+        <w:jc w:val="center"/>
+        <w:rPr>
+          <w:sz w:val="20"/>
+          <w:szCs w:val="20"/>
+        </w:rPr>
+      </w:pPr>
+    </w:p>
+    <w:p>
+      <w:pPr>
+        <w:tabs>
+          <w:tab w:val="left" w:pos="1500"/>
+        </w:tabs>
+        <w:spacing w:after="0" w:line="240" w:lineRule="auto"/>
+        <w:jc w:val="center"/>
+        <w:rPr>
+          <w:sz w:val="20"/>
+          <w:szCs w:val="20"/>
+        </w:rPr>
+      </w:pPr>
+    </w:p>
+    <w:p>
+      <w:pPr>
+        <w:tabs>
+          <w:tab w:val="left" w:pos="1500"/>
+        </w:tabs>
+        <w:spacing w:after="0" w:line="240" w:lineRule="auto"/>
+        <w:jc w:val="center"/>
+        <w:rPr>
+          <w:sz w:val="20"/>
+          <w:szCs w:val="20"/>
+        </w:rPr>
+      </w:pPr>
+    </w:p>
+    <w:p>
+      <w:pPr>
+        <w:tabs>
+          <w:tab w:val="left" w:pos="1500"/>
+        </w:tabs>
+        <w:spacing w:after="0" w:line="240" w:lineRule="auto"/>
+        <w:jc w:val="center"/>
+        <w:rPr>
+          <w:sz w:val="20"/>
+          <w:szCs w:val="20"/>
+        </w:rPr>
+      </w:pPr>
+    </w:p>
+    <w:p>
+      <w:pPr>
+        <w:tabs>
+          <w:tab w:val="left" w:pos="1500"/>
+        </w:tabs>
+        <w:spacing w:after="0" w:line="240" w:lineRule="auto"/>
+        <w:jc w:val="center"/>
+        <w:rPr>
+          <w:sz w:val="20"/>
+          <w:szCs w:val="20"/>
+        </w:rPr>
+      </w:pPr>
+    </w:p>
+    <w:p>
+      <w:pPr>
+        <w:tabs>
+          <w:tab w:val="left" w:pos="1500"/>
+        </w:tabs>
+        <w:spacing w:after="0" w:line="240" w:lineRule="auto"/>
+        <w:jc w:val="center"/>
+        <w:rPr>
+          <w:sz w:val="20"/>
+          <w:szCs w:val="20"/>
+        </w:rPr>
+      </w:pPr>
+    </w:p>
+    <w:p>
+      <w:pPr>
+        <w:tabs>
+          <w:tab w:val="left" w:pos="1500"/>
+        </w:tabs>
+        <w:spacing w:after="0" w:line="240" w:lineRule="auto"/>
+        <w:jc w:val="center"/>
+        <w:rPr>
+          <w:sz w:val="20"/>
+          <w:szCs w:val="20"/>
+        </w:rPr>
+      </w:pPr>
+    </w:p>
+    <w:p>
+      <w:pPr>
+        <w:tabs>
+          <w:tab w:val="left" w:pos="1500"/>
+        </w:tabs>
+        <w:spacing w:after="0" w:line="240" w:lineRule="auto"/>
+        <w:jc w:val="center"/>
+        <w:rPr>
+          <w:sz w:val="20"/>
+          <w:szCs w:val="20"/>
+        </w:rPr>
+      </w:pPr>
+    </w:p>
+    <w:p>
+      <w:pPr>
+        <w:tabs>
+          <w:tab w:val="left" w:pos="1500"/>
+        </w:tabs>
+        <w:spacing w:after="0" w:line="240" w:lineRule="auto"/>
+        <w:jc w:val="center"/>
+        <w:rPr>
+          <w:sz w:val="20"/>
+          <w:szCs w:val="20"/>
+        </w:rPr>
+      </w:pPr>
+    </w:p>
+    <w:p>
+      <w:pPr>
+        <w:tabs>
+          <w:tab w:val="left" w:pos="1500"/>
+        </w:tabs>
+        <w:spacing w:after="0" w:line="240" w:lineRule="auto"/>
+        <w:jc w:val="center"/>
+        <w:rPr>
+          <w:sz w:val="20"/>
+          <w:szCs w:val="20"/>
+        </w:rPr>
+      </w:pPr>
+    </w:p>
+    <w:p>
+      <w:pPr>
+        <w:tabs>
+          <w:tab w:val="left" w:pos="1500"/>
+        </w:tabs>
+        <w:spacing w:after="0" w:line="240" w:lineRule="auto"/>
+        <w:jc w:val="center"/>
+        <w:rPr>
+          <w:sz w:val="20"/>
+          <w:szCs w:val="20"/>
+        </w:rPr>
+      </w:pPr>
+    </w:p>
+    <w:p>
+      <w:pPr>
+        <w:rPr>
+          <w:sz w:val="18"/>
+          <w:szCs w:val="18"/>
+        </w:rPr>
+      </w:pPr>
+      <w:r>
+        <w:rPr>
+          <w:sz w:val="18"/>
+          <w:szCs w:val="18"/>
+        </w:rPr>
+        <w:t>%/</w:t>
+      </w:r>
+      <w:proofErr w:type="spellStart"/>
+      <w:r>
+        <w:rPr>
+          <w:sz w:val="18"/>
+          <w:szCs w:val="18"/>
+        </w:rPr>
+        <w:t>estudiantes_lista</w:t>
+      </w:r>
+      <w:proofErr w:type="spellEnd"/>
+      <w:r>
+        <w:rPr>
+          <w:sz w:val="18"/>
+          <w:szCs w:val="18"/>
+        </w:rPr>
+        <w:t>%</w:t>
+      </w:r>
+    </w:p>
+    <w:p>
+      <w:pPr>
+        <w:tabs>
+          <w:tab w:val="left" w:pos="1500"/>
+        </w:tabs>
+        <w:spacing w:after="0" w:line="240" w:lineRule="auto"/>
+        <w:jc w:val="center"/>
+        <w:rPr>
           <w:rFonts w:ascii="Arial" w:hAnsi="Arial" w:cs="Arial"/>
           <w:b/>
           <w:bCs/>
         </w:rPr>
       </w:pPr>
-      <w:r>
-        <w:rPr>
-          <w:sz w:val="20"/>
-          <w:szCs w:val="20"/>
-        </w:rPr>
-        <w:t>Firma del Docente</w:t>
-      </w:r>
     </w:p>
     <w:sectPr>
       <w:headerReference w:type="even" r:id="rId8"/>
@@ -2059,14 +2547,23 @@
         <w:szCs w:val="20"/>
         <w:lang w:val="es-MX"/>
       </w:rPr>
-      <w:t xml:space="preserve">Condominio Ipanema </w:t>
+      <w:t xml:space="preserve">Condominio </w:t>
     </w:r>
+    <w:proofErr w:type="gramStart"/>
     <w:r>
       <w:rPr>
         <w:sz w:val="20"/>
         <w:szCs w:val="20"/>
         <w:lang w:val="es-MX"/>
       </w:rPr>
+      <w:t xml:space="preserve">Ipanema </w:t>
+    </w:r>
+    <w:r>
+      <w:rPr>
+        <w:sz w:val="20"/>
+        <w:szCs w:val="20"/>
+        <w:lang w:val="es-MX"/>
+      </w:rPr>
       <w:t xml:space="preserve"> To</w:t>
     </w:r>
     <w:r>
@@ -2075,7 +2572,16 @@
         <w:szCs w:val="20"/>
         <w:lang w:val="es-MX"/>
       </w:rPr>
-      <w:t>rre 3 107</w:t>
+      <w:t>rre</w:t>
+    </w:r>
+    <w:proofErr w:type="gramEnd"/>
+    <w:r>
+      <w:rPr>
+        <w:sz w:val="20"/>
+        <w:szCs w:val="20"/>
+        <w:lang w:val="es-MX"/>
+      </w:rPr>
+      <w:t xml:space="preserve"> 3 107</w:t>
     </w:r>
   </w:p>
   <w:p>
@@ -2463,7 +2969,15 @@
       <w:t>0339</w:t>
     </w:r>
     <w:r>
-      <w:t xml:space="preserve"> de Enero 25 del 2022</w:t>
+      <w:t xml:space="preserve"> de </w:t>
+    </w:r>
+    <w:proofErr w:type="gramStart"/>
+    <w:r>
+      <w:t>Enero</w:t>
+    </w:r>
+    <w:proofErr w:type="gramEnd"/>
+    <w:r>
+      <w:t xml:space="preserve"> 25 del 2022</w:t>
     </w:r>
     <w:r>
       <w:t xml:space="preserve"> NIT: 806.013.263-0</w:t>
@@ -3018,7 +3532,6 @@
   <w:style w:type="character" w:default="1" w:styleId="Fuentedeprrafopredeter">
     <w:name w:val="Default Paragraph Font"/>
     <w:uiPriority w:val="1"/>
-    <w:semiHidden/>
     <w:unhideWhenUsed/>
   </w:style>
   <w:style w:type="table" w:default="1" w:styleId="Tablanormal">

</xml_diff>